<commit_message>
Update Finance Manager and Bookkeeper Ads: FM now shows payroll ownership and expense approval. Bookkeeper now shows payroll processing as core duty and required qualification. Both ads match updated JDs.
</commit_message>
<xml_diff>
--- a/careers/ads/Batch7_Ads_Operations_and_Development.docx
+++ b/careers/ads/Batch7_Ads_Operations_and_Development.docx
@@ -569,6 +569,24 @@
           <w:szCs w:val="22"/>
         </w:rPr>
         <w:t xml:space="preserve">Produce monthly financials, forecasts, and board-ready reports.</w:t>
+      </w:r>
+    </w:p>
+    <w:p>
+      <w:pPr>
+        <w:pStyle w:val="ListParagraph"/>
+        <w:numPr>
+          <w:ilvl w:val="0"/>
+          <w:numId w:val="2"/>
+        </w:numPr>
+        <w:spacing w:after="80"/>
+      </w:pPr>
+      <w:r>
+        <w:rPr>
+          <w:rFonts w:ascii="Arial" w:cs="Arial" w:eastAsia="Arial" w:hAnsi="Arial"/>
+          <w:sz w:val="22"/>
+          <w:szCs w:val="22"/>
+        </w:rPr>
+        <w:t xml:space="preserve">Own the payroll function: manage the payroll service, approve expense reports and vendor payments, and ensure every employee is paid correctly and on time.</w:t>
       </w:r>
     </w:p>
     <w:p>
@@ -902,7 +920,7 @@
           <w:sz w:val="22"/>
           <w:szCs w:val="22"/>
         </w:rPr>
-        <w:t xml:space="preserve">Audacion AI Labs needs clean books to support grant reporting, monthly closes, and board-level financial statements. The Bookkeeper handles daily record-keeping: invoices, transactions, reconciliations, and the accuracy the Finance Manager depends on.</w:t>
+        <w:t xml:space="preserve">Audacion AI Labs needs clean books to support grant reporting, monthly closes, and board-level financial statements. The Bookkeeper handles daily record-keeping: invoices, transactions, reconciliations, payroll inputs, and the accuracy the Finance Manager depends on.</w:t>
       </w:r>
     </w:p>
     <w:p>
@@ -985,6 +1003,24 @@
           <w:sz w:val="22"/>
           <w:szCs w:val="22"/>
         </w:rPr>
+        <w:t xml:space="preserve">Process payroll inputs and reconcile payroll records after each pay cycle.</w:t>
+      </w:r>
+    </w:p>
+    <w:p>
+      <w:pPr>
+        <w:pStyle w:val="ListParagraph"/>
+        <w:numPr>
+          <w:ilvl w:val="0"/>
+          <w:numId w:val="2"/>
+        </w:numPr>
+        <w:spacing w:after="80"/>
+      </w:pPr>
+      <w:r>
+        <w:rPr>
+          <w:rFonts w:ascii="Arial" w:cs="Arial" w:eastAsia="Arial" w:hAnsi="Arial"/>
+          <w:sz w:val="22"/>
+          <w:szCs w:val="22"/>
+        </w:rPr>
         <w:t xml:space="preserve">Support grant financial tracking by coding expenses to correct categories.</w:t>
       </w:r>
     </w:p>
@@ -1079,6 +1115,24 @@
           <w:szCs w:val="22"/>
         </w:rPr>
         <w:t xml:space="preserve">Strong attention to detail and accuracy.</w:t>
+      </w:r>
+    </w:p>
+    <w:p>
+      <w:pPr>
+        <w:pStyle w:val="ListParagraph"/>
+        <w:numPr>
+          <w:ilvl w:val="0"/>
+          <w:numId w:val="2"/>
+        </w:numPr>
+        <w:spacing w:after="80"/>
+      </w:pPr>
+      <w:r>
+        <w:rPr>
+          <w:rFonts w:ascii="Arial" w:cs="Arial" w:eastAsia="Arial" w:hAnsi="Arial"/>
+          <w:sz w:val="22"/>
+          <w:szCs w:val="22"/>
+        </w:rPr>
+        <w:t xml:space="preserve">Experience with payroll processing and payroll service platforms.</w:t>
       </w:r>
     </w:p>
     <w:p>

</xml_diff>

<commit_message>
Update Batch 7 JDs and Ads: Senior EA (title, 3 C-suite leaders, $110K-$150K). Recruiter (non-traditional sourcing, pattern recognition, see talent in non-obvious candidates). Both JDs and Ads updated.
</commit_message>
<xml_diff>
--- a/careers/ads/Batch7_Ads_Operations_and_Development.docx
+++ b/careers/ads/Batch7_Ads_Operations_and_Development.docx
@@ -2217,7 +2217,7 @@
           <w:sz w:val="22"/>
           <w:szCs w:val="22"/>
         </w:rPr>
-        <w:t xml:space="preserve">Audacion AI Labs is hiring research scientists, engineers, event producers, sales reps, creative directors, and operations staff. All within the same organization. All within Year 1. The Internal Talent Recruiter owns the entire hiring pipeline.</w:t>
+        <w:t xml:space="preserve">Audacion AI Labs is hiring research scientists, engineers, event producers, sales reps, creative directors, and operations staff. All within the same organization. All within Year 1. The Internal Talent Recruiter owns the entire hiring pipeline. But this is not a traditional recruiting role. Many of the people this lab needs will not be found on job boards. The best Pillar Lead might be someone who has never applied to a research lab. The best analyst might be someone whose resume does not check the usual boxes. You need the instinct to see talent where others see gaps, the creativity to source in non-traditional places, and the ability to translate real experience into real qualifications.</w:t>
       </w:r>
     </w:p>
     <w:p>
@@ -2608,7 +2608,7 @@
           <w:sz w:val="40"/>
           <w:szCs w:val="40"/>
         </w:rPr>
-        <w:t xml:space="preserve">Executive Assistant to the CEO</w:t>
+        <w:t xml:space="preserve">Senior Executive Assistant</w:t>
       </w:r>
     </w:p>
     <w:p>
@@ -2623,7 +2623,7 @@
           <w:sz w:val="22"/>
           <w:szCs w:val="22"/>
         </w:rPr>
-        <w:t xml:space="preserve">Los Angeles, CA  |  Full-Time, Exempt  |  $85,000 to $120,000</w:t>
+        <w:t xml:space="preserve">Los Angeles, CA  |  Full-Time, Exempt  |  $110,000 to $150,000</w:t>
       </w:r>
     </w:p>
     <w:p>
@@ -2937,7 +2937,7 @@
           <w:sz w:val="22"/>
           <w:szCs w:val="22"/>
         </w:rPr>
-        <w:t xml:space="preserve">$85,000 to $120,000 annually, commensurate with experience. Comprehensive benefits including health, dental, vision, 401(k), PTO, professional development, and conference travel.</w:t>
+        <w:t xml:space="preserve">$110,000 to $150,000 annually, commensurate with experience. Comprehensive benefits including health, dental, vision, 401(k), PTO, professional development, and conference travel.</w:t>
       </w:r>
     </w:p>
     <w:p>
@@ -2966,7 +2966,7 @@
           <w:sz w:val="22"/>
           <w:szCs w:val="22"/>
         </w:rPr>
-        <w:t xml:space="preserve">Send your CV and a cover letter to careers@audacionailabs.com. Subject line: "Executive Assistant to CEO."</w:t>
+        <w:t xml:space="preserve">Send your CV and a cover letter to careers@audacionailabs.com. Subject line: "Senior Executive Assistant."</w:t>
       </w:r>
     </w:p>
     <w:p>

</xml_diff>